<commit_message>
Extend appendix C with Sela's findings pages (381-382)
Pages 331-334 establish what the article proposes but stop short of its
result: the abstract says an experiment was run without stating its
outcome. The chapter-head text leans on that outcome ("ממחקרה עולה
שעיצוב נכון של סביבת ההתדיינות משפר את חוויית ההליך ההוגן"), so the
appendix now also carries pp. 381-382, where Part V states the findings
and their implications.

Chose 381-382 over the closing pages 385-386, which cover study
limitations and general remarks rather than the finding itself.

Heading updated to "עמ' 331-334, 381-382".

Co-Authored-By: Claude Opus 5 <noreply@anthropic.com>
Claude-Session: https://claude.ai/code/session_01XCZtF9Dr6m5fm79bU6Q8gU
</commit_message>
<xml_diff>
--- a/docs/תשתית לראש פרק - הדר פוקס.docx
+++ b/docs/תשתית לראש פרק - הדר פוקס.docx
@@ -1252,7 +1252,7 @@
           <w:u w:val="single"/>
           <w:rtl/>
         </w:rPr>
-        <w:t xml:space="preserve">נספח ג: Sela (2016), עמ' 331-334 (עמוד השער והתקציר, המבוא ומבנה הטיעון)</w:t>
+        <w:t xml:space="preserve">נספח ג: Sela (2016), עמ' 331-334, 381-382 (עמוד השער והתקציר, המבוא, וממצאי המחקר והשלכותיהם)</w:t>
       </w:r>
     </w:p>
     <w:p>
@@ -1418,6 +1418,98 @@
                   </pic:nvPicPr>
                   <pic:blipFill>
                     <a:blip r:embed="rId23" cstate="none"/>
+                    <a:srcRect/>
+                    <a:stretch>
+                      <a:fillRect/>
+                    </a:stretch>
+                  </pic:blipFill>
+                  <pic:spPr bwMode="auto">
+                    <a:xfrm>
+                      <a:off x="0" y="0"/>
+                      <a:ext cx="4411362" cy="6800850"/>
+                    </a:xfrm>
+                    <a:prstGeom prst="rect">
+                      <a:avLst/>
+                    </a:prstGeom>
+                  </pic:spPr>
+                </pic:pic>
+              </a:graphicData>
+            </a:graphic>
+          </wp:inline>
+        </w:drawing>
+      </w:r>
+    </w:p>
+    <w:p>
+      <w:pPr>
+        <w:spacing w:after="60"/>
+        <w:jc w:val="center"/>
+      </w:pPr>
+      <w:r>
+        <w:drawing>
+          <wp:inline distT="0" distB="0" distL="0" distR="0">
+            <wp:extent cx="4411362" cy="6800850"/>
+            <wp:effectExtent t="0" r="0" b="0" l="0"/>
+            <wp:docPr id="1" name="" descr="" title=""/>
+            <wp:cNvGraphicFramePr>
+              <a:graphicFrameLocks xmlns:a="http://schemas.openxmlformats.org/drawingml/2006/main" noChangeAspect="1"/>
+            </wp:cNvGraphicFramePr>
+            <a:graphic xmlns:a="http://schemas.openxmlformats.org/drawingml/2006/main">
+              <a:graphicData uri="http://schemas.openxmlformats.org/drawingml/2006/picture">
+                <pic:pic xmlns:pic="http://schemas.openxmlformats.org/drawingml/2006/picture">
+                  <pic:nvPicPr>
+                    <pic:cNvPr id="0" name="" descr=""/>
+                    <pic:cNvPicPr>
+                      <a:picLocks noChangeAspect="1" noChangeArrowheads="1"/>
+                    </pic:cNvPicPr>
+                  </pic:nvPicPr>
+                  <pic:blipFill>
+                    <a:blip r:embed="rId24" cstate="none"/>
+                    <a:srcRect/>
+                    <a:stretch>
+                      <a:fillRect/>
+                    </a:stretch>
+                  </pic:blipFill>
+                  <pic:spPr bwMode="auto">
+                    <a:xfrm>
+                      <a:off x="0" y="0"/>
+                      <a:ext cx="4411362" cy="6800850"/>
+                    </a:xfrm>
+                    <a:prstGeom prst="rect">
+                      <a:avLst/>
+                    </a:prstGeom>
+                  </pic:spPr>
+                </pic:pic>
+              </a:graphicData>
+            </a:graphic>
+          </wp:inline>
+        </w:drawing>
+      </w:r>
+    </w:p>
+    <w:p>
+      <w:pPr>
+        <w:spacing w:after="60"/>
+        <w:jc w:val="center"/>
+      </w:pPr>
+      <w:r>
+        <w:drawing>
+          <wp:inline distT="0" distB="0" distL="0" distR="0">
+            <wp:extent cx="4411362" cy="6800850"/>
+            <wp:effectExtent t="0" r="0" b="0" l="0"/>
+            <wp:docPr id="1" name="" descr="" title=""/>
+            <wp:cNvGraphicFramePr>
+              <a:graphicFrameLocks xmlns:a="http://schemas.openxmlformats.org/drawingml/2006/main" noChangeAspect="1"/>
+            </wp:cNvGraphicFramePr>
+            <a:graphic xmlns:a="http://schemas.openxmlformats.org/drawingml/2006/main">
+              <a:graphicData uri="http://schemas.openxmlformats.org/drawingml/2006/picture">
+                <pic:pic xmlns:pic="http://schemas.openxmlformats.org/drawingml/2006/picture">
+                  <pic:nvPicPr>
+                    <pic:cNvPr id="0" name="" descr=""/>
+                    <pic:cNvPicPr>
+                      <a:picLocks noChangeAspect="1" noChangeArrowheads="1"/>
+                    </pic:cNvPicPr>
+                  </pic:nvPicPr>
+                  <pic:blipFill>
+                    <a:blip r:embed="rId25" cstate="none"/>
                     <a:srcRect/>
                     <a:stretch>
                       <a:fillRect/>

</xml_diff>

<commit_message>
Add college logo to the title page
Places the המסלול האקדמי המכללה למינהל logo centered at the top of the
title page, above the institution and school lines.

The source was a phone screenshot with letterboxing; cropped to the
logo's bounding box (with a small margin) and downscaled to 900px wide.
Displayed at 1.7" wide with the aspect ratio preserved, so the title
page still fits on one page and the document stays at 21 pages.

Co-Authored-By: Claude Opus 5 <noreply@anthropic.com>
Claude-Session: https://claude.ai/code/session_01XCZtF9Dr6m5fm79bU6Q8gU
</commit_message>
<xml_diff>
--- a/docs/תשתית לראש פרק - הדר פוקס.docx
+++ b/docs/תשתית לראש פרק - הדר פוקס.docx
@@ -2,6 +2,53 @@
 <file path=word/document.xml><?xml version="1.0" encoding="utf-8"?>
 <w:document xmlns:wpc="http://schemas.microsoft.com/office/word/2010/wordprocessingCanvas" xmlns:mc="http://schemas.openxmlformats.org/markup-compatibility/2006" xmlns:o="urn:schemas-microsoft-com:office:office" xmlns:r="http://schemas.openxmlformats.org/officeDocument/2006/relationships" xmlns:m="http://schemas.openxmlformats.org/officeDocument/2006/math" xmlns:v="urn:schemas-microsoft-com:vml" xmlns:wp14="http://schemas.microsoft.com/office/word/2010/wordprocessingDrawing" xmlns:wp="http://schemas.openxmlformats.org/drawingml/2006/wordprocessingDrawing" xmlns:w10="urn:schemas-microsoft-com:office:word" xmlns:w="http://schemas.openxmlformats.org/wordprocessingml/2006/main" xmlns:w14="http://schemas.microsoft.com/office/word/2010/wordml" xmlns:w15="http://schemas.microsoft.com/office/word/2012/wordml" xmlns:wpg="http://schemas.microsoft.com/office/word/2010/wordprocessingGroup" xmlns:wpi="http://schemas.microsoft.com/office/word/2010/wordprocessingInk" xmlns:wne="http://schemas.microsoft.com/office/word/2006/wordml" xmlns:wps="http://schemas.microsoft.com/office/word/2010/wordprocessingShape" xmlns:cx="http://schemas.microsoft.com/office/drawing/2014/chartex" xmlns:cx1="http://schemas.microsoft.com/office/drawing/2015/9/8/chartex" xmlns:cx2="http://schemas.microsoft.com/office/drawing/2015/10/21/chartex" xmlns:cx3="http://schemas.microsoft.com/office/drawing/2016/5/9/chartex" xmlns:cx4="http://schemas.microsoft.com/office/drawing/2016/5/10/chartex" xmlns:cx5="http://schemas.microsoft.com/office/drawing/2016/5/11/chartex" xmlns:cx6="http://schemas.microsoft.com/office/drawing/2016/5/12/chartex" xmlns:cx7="http://schemas.microsoft.com/office/drawing/2016/5/13/chartex" xmlns:cx8="http://schemas.microsoft.com/office/drawing/2016/5/14/chartex" xmlns:aink="http://schemas.microsoft.com/office/drawing/2016/ink" xmlns:am3d="http://schemas.microsoft.com/office/drawing/2017/model3d" xmlns:w16cex="http://schemas.microsoft.com/office/word/2018/wordml/cex" xmlns:w16cid="http://schemas.microsoft.com/office/word/2016/wordml/cid" xmlns:w16="http://schemas.microsoft.com/office/word/2018/wordml" xmlns:w16sdtdh="http://schemas.microsoft.com/office/word/2020/wordml/sdtdatahash" xmlns:w16se="http://schemas.microsoft.com/office/word/2015/wordml/symex" mc:Ignorable="w14 w15 wp14">
   <w:body>
+    <w:p>
+      <w:pPr>
+        <w:bidi/>
+        <w:spacing w:after="180" w:before="0"/>
+        <w:jc w:val="center"/>
+      </w:pPr>
+      <w:r>
+        <w:drawing>
+          <wp:inline distT="0" distB="0" distL="0" distR="0">
+            <wp:extent cx="1554480" cy="1473302"/>
+            <wp:effectExtent t="0" r="0" b="0" l="0"/>
+            <wp:docPr id="1" name="" descr="לוגו המסלול האקדמי המכללה למינהל" title=""/>
+            <wp:cNvGraphicFramePr>
+              <a:graphicFrameLocks xmlns:a="http://schemas.openxmlformats.org/drawingml/2006/main" noChangeAspect="1"/>
+            </wp:cNvGraphicFramePr>
+            <a:graphic xmlns:a="http://schemas.openxmlformats.org/drawingml/2006/main">
+              <a:graphicData uri="http://schemas.openxmlformats.org/drawingml/2006/picture">
+                <pic:pic xmlns:pic="http://schemas.openxmlformats.org/drawingml/2006/picture">
+                  <pic:nvPicPr>
+                    <pic:cNvPr id="0" name="" descr=""/>
+                    <pic:cNvPicPr>
+                      <a:picLocks noChangeAspect="1" noChangeArrowheads="1"/>
+                    </pic:cNvPicPr>
+                  </pic:nvPicPr>
+                  <pic:blipFill>
+                    <a:blip r:embed="rId27" cstate="none"/>
+                    <a:srcRect/>
+                    <a:stretch>
+                      <a:fillRect/>
+                    </a:stretch>
+                  </pic:blipFill>
+                  <pic:spPr bwMode="auto">
+                    <a:xfrm>
+                      <a:off x="0" y="0"/>
+                      <a:ext cx="1554480" cy="1473302"/>
+                    </a:xfrm>
+                    <a:prstGeom prst="rect">
+                      <a:avLst/>
+                    </a:prstGeom>
+                  </pic:spPr>
+                </pic:pic>
+              </a:graphicData>
+            </a:graphic>
+          </wp:inline>
+        </w:drawing>
+      </w:r>
+    </w:p>
     <w:p>
       <w:pPr>
         <w:bidi/>

</xml_diff>